<commit_message>
Contrarrazões ao agravo: cita a contestação do banco, o recibo SPB e a certidão de trânsito
Co-Authored-By: Claude Opus 5.5 <noreply@anthropic.com>
Claude-Session: https://claude.ai/code/session_01RSEcSvs1Px517d8mUYokdi
</commit_message>
<xml_diff>
--- a/0800122-42.2025 - Francisca Sousa/Contrarrazões ao agravo de instrumento - Francisca Sousa da Silva.docx
+++ b/0800122-42.2025 - Francisca Sousa/Contrarrazões ao agravo de instrumento - Francisca Sousa da Silva.docx
@@ -768,32 +768,142 @@
       <w:r>
         <w:rPr>
           <w:rFonts w:ascii="Lora Medium" w:cs="Lora Medium" w:eastAsia="Lora Medium" w:hAnsi="Lora Medium"/>
+          <w:bCs w:val="1"/>
           <w:sz w:val="20"/>
           <w:szCs w:val="20"/>
           <w:rtl w:val="0"/>
         </w:rPr>
-        <w:t xml:space="preserve">c)</w:t>
+        <w:t>c)</w:t>
         <w:tab/>
       </w:r>
       <w:r>
         <w:rPr>
           <w:rFonts w:ascii="Lora Medium" w:cs="Lora Medium" w:eastAsia="Lora Medium" w:hAnsi="Lora Medium"/>
-          <w:b w:val="1"/>
+          <w:b/>
           <w:bCs w:val="1"/>
           <w:sz w:val="20"/>
           <w:szCs w:val="20"/>
           <w:rtl w:val="0"/>
         </w:rPr>
-        <w:t xml:space="preserve">até 29/05/2025</w:t>
-      </w:r>
-      <w:r>
-        <w:rPr>
-          <w:rFonts w:ascii="Lora Medium" w:cs="Lora Medium" w:eastAsia="Lora Medium" w:hAnsi="Lora Medium"/>
+        <w:t>12/05/2025</w:t>
+      </w:r>
+      <w:r>
+        <w:rPr>
+          <w:rFonts w:ascii="Lora Medium" w:cs="Lora Medium" w:eastAsia="Lora Medium" w:hAnsi="Lora Medium"/>
+          <w:bCs w:val="1"/>
           <w:sz w:val="20"/>
           <w:szCs w:val="20"/>
           <w:rtl w:val="0"/>
         </w:rPr>
-        <w:t xml:space="preserve"> – contestação, na qual o banco </w:t>
+        <w:t xml:space="preserve"> – contestação (ID 75506718), na qual o banco </w:t>
+      </w:r>
+      <w:r>
+        <w:rPr>
+          <w:rFonts w:ascii="Lora Medium" w:cs="Lora Medium" w:eastAsia="Lora Medium" w:hAnsi="Lora Medium"/>
+          <w:b/>
+          <w:bCs w:val="1"/>
+          <w:sz w:val="20"/>
+          <w:szCs w:val="20"/>
+          <w:rtl w:val="0"/>
+        </w:rPr>
+        <w:t>já afirmava que os valores descontados haviam sido “devidamente restituídos”</w:t>
+      </w:r>
+      <w:r>
+        <w:rPr>
+          <w:rFonts w:ascii="Lora Medium" w:cs="Lora Medium" w:eastAsia="Lora Medium" w:hAnsi="Lora Medium"/>
+          <w:bCs w:val="1"/>
+          <w:sz w:val="20"/>
+          <w:szCs w:val="20"/>
+          <w:rtl w:val="0"/>
+        </w:rPr>
+        <w:t>, alegação rebatida na réplica (ID 76604920);</w:t>
+      </w:r>
+    </w:p>
+    <w:p>
+      <w:pPr>
+        <w:spacing w:after="0" w:line="360" w:lineRule="auto"/>
+        <w:ind w:left="2267.716535433071" w:hanging="570"/>
+        <w:jc w:val="both"/>
+        <w:rPr>
+          <w:sz w:val="20"/>
+          <w:szCs w:val="20"/>
+        </w:rPr>
+      </w:pPr>
+      <w:r>
+        <w:rPr>
+          <w:rFonts w:ascii="Lora Medium" w:cs="Lora Medium" w:eastAsia="Lora Medium" w:hAnsi="Lora Medium"/>
+          <w:sz w:val="20"/>
+          <w:szCs w:val="20"/>
+          <w:rtl w:val="0"/>
+        </w:rPr>
+        <w:t xml:space="preserve">d)</w:t>
+        <w:tab/>
+      </w:r>
+      <w:r>
+        <w:rPr>
+          <w:rFonts w:ascii="Lora Medium" w:cs="Lora Medium" w:eastAsia="Lora Medium" w:hAnsi="Lora Medium"/>
+          <w:b w:val="1"/>
+          <w:bCs w:val="1"/>
+          <w:sz w:val="20"/>
+          <w:szCs w:val="20"/>
+          <w:rtl w:val="0"/>
+        </w:rPr>
+        <w:t xml:space="preserve">18/06/2025</w:t>
+      </w:r>
+      <w:r>
+        <w:rPr>
+          <w:rFonts w:ascii="Lora Medium" w:cs="Lora Medium" w:eastAsia="Lora Medium" w:hAnsi="Lora Medium"/>
+          <w:sz w:val="20"/>
+          <w:szCs w:val="20"/>
+          <w:rtl w:val="0"/>
+        </w:rPr>
+        <w:t xml:space="preserve"> – estorno das 31 parcelas do contrato nº 365738167-3 (R$ 224,00 cada);</w:t>
+      </w:r>
+      <w:r>
+        <w:rPr>
+          <w:rtl w:val="0"/>
+        </w:rPr>
+      </w:r>
+    </w:p>
+    <w:p>
+      <w:pPr>
+        <w:spacing w:after="0" w:line="360" w:lineRule="auto"/>
+        <w:ind w:left="2267.716535433071" w:hanging="570"/>
+        <w:jc w:val="both"/>
+        <w:rPr>
+          <w:sz w:val="20"/>
+          <w:szCs w:val="20"/>
+        </w:rPr>
+      </w:pPr>
+      <w:r>
+        <w:rPr>
+          <w:rFonts w:ascii="Lora Medium" w:cs="Lora Medium" w:eastAsia="Lora Medium" w:hAnsi="Lora Medium"/>
+          <w:sz w:val="20"/>
+          <w:szCs w:val="20"/>
+          <w:rtl w:val="0"/>
+        </w:rPr>
+        <w:t xml:space="preserve">e)</w:t>
+        <w:tab/>
+      </w:r>
+      <w:r>
+        <w:rPr>
+          <w:rFonts w:ascii="Lora Medium" w:cs="Lora Medium" w:eastAsia="Lora Medium" w:hAnsi="Lora Medium"/>
+          <w:b w:val="1"/>
+          <w:bCs w:val="1"/>
+          <w:sz w:val="20"/>
+          <w:szCs w:val="20"/>
+          <w:rtl w:val="0"/>
+        </w:rPr>
+        <w:t xml:space="preserve">08/08/2025</w:t>
+      </w:r>
+      <w:r>
+        <w:rPr>
+          <w:rFonts w:ascii="Lora Medium" w:cs="Lora Medium" w:eastAsia="Lora Medium" w:hAnsi="Lora Medium"/>
+          <w:sz w:val="20"/>
+          <w:szCs w:val="20"/>
+          <w:rtl w:val="0"/>
+        </w:rPr>
+        <w:t xml:space="preserve"> – </w:t>
       </w:r>
       <w:r>
         <w:rPr>
@@ -806,7 +916,7 @@
           <w:shd w:fill="cfe2f3" w:val="clear"/>
           <w:rtl w:val="0"/>
         </w:rPr>
-        <w:t xml:space="preserve">já alegava ter restituído os valores</w:t>
+        <w:t xml:space="preserve">sentença</w:t>
       </w:r>
       <w:r>
         <w:rPr>
@@ -815,7 +925,7 @@
           <w:szCs w:val="20"/>
           <w:rtl w:val="0"/>
         </w:rPr>
-        <w:t xml:space="preserve">, alegação rebatida na réplica (ID 76604920, pág. 5);</w:t>
+        <w:t xml:space="preserve">, que condenou o banco à restituição sem reconhecer nenhuma devolução;</w:t>
       </w:r>
       <w:r>
         <w:rPr>
@@ -840,7 +950,7 @@
           <w:szCs w:val="20"/>
           <w:rtl w:val="0"/>
         </w:rPr>
-        <w:t xml:space="preserve">d)</w:t>
+        <w:t xml:space="preserve">f)</w:t>
         <w:tab/>
       </w:r>
       <w:r>
@@ -852,7 +962,7 @@
           <w:szCs w:val="20"/>
           <w:rtl w:val="0"/>
         </w:rPr>
-        <w:t xml:space="preserve">18/06/2025</w:t>
+        <w:t xml:space="preserve">19/08/2025</w:t>
       </w:r>
       <w:r>
         <w:rPr>
@@ -861,7 +971,7 @@
           <w:szCs w:val="20"/>
           <w:rtl w:val="0"/>
         </w:rPr>
-        <w:t xml:space="preserve"> – estorno das 31 parcelas do contrato nº 365738167-3 (R$ 224,00 cada);</w:t>
+        <w:t xml:space="preserve"> – embargos de declaração do banco contra a sentença, sem nenhuma menção aos estornos;</w:t>
       </w:r>
       <w:r>
         <w:rPr>
@@ -882,181 +992,82 @@
       <w:r>
         <w:rPr>
           <w:rFonts w:ascii="Lora Medium" w:cs="Lora Medium" w:eastAsia="Lora Medium" w:hAnsi="Lora Medium"/>
+          <w:bCs w:val="1"/>
           <w:sz w:val="20"/>
           <w:szCs w:val="20"/>
           <w:rtl w:val="0"/>
         </w:rPr>
-        <w:t xml:space="preserve">e)</w:t>
+        <w:t>g)</w:t>
         <w:tab/>
       </w:r>
       <w:r>
         <w:rPr>
           <w:rFonts w:ascii="Lora Medium" w:cs="Lora Medium" w:eastAsia="Lora Medium" w:hAnsi="Lora Medium"/>
-          <w:b w:val="1"/>
+          <w:b/>
           <w:bCs w:val="1"/>
           <w:sz w:val="20"/>
           <w:szCs w:val="20"/>
           <w:rtl w:val="0"/>
         </w:rPr>
-        <w:t xml:space="preserve">08/08/2025</w:t>
-      </w:r>
-      <w:r>
-        <w:rPr>
-          <w:rFonts w:ascii="Lora Medium" w:cs="Lora Medium" w:eastAsia="Lora Medium" w:hAnsi="Lora Medium"/>
+        <w:t>08/12/2025</w:t>
+      </w:r>
+      <w:r>
+        <w:rPr>
+          <w:rFonts w:ascii="Lora Medium" w:cs="Lora Medium" w:eastAsia="Lora Medium" w:hAnsi="Lora Medium"/>
+          <w:bCs w:val="1"/>
           <w:sz w:val="20"/>
           <w:szCs w:val="20"/>
           <w:rtl w:val="0"/>
         </w:rPr>
-        <w:t xml:space="preserve"> – </w:t>
-      </w:r>
-      <w:r>
-        <w:rPr>
-          <w:rFonts w:ascii="Lora Medium" w:cs="Lora Medium" w:eastAsia="Lora Medium" w:hAnsi="Lora Medium"/>
-          <w:b w:val="1"/>
-          <w:bCs w:val="1"/>
-          <w:sz w:val="20"/>
-          <w:szCs w:val="20"/>
+        <w:t xml:space="preserve"> – trânsito em julgado, conforme certidão (ID 93346877).</w:t>
+      </w:r>
+    </w:p>
+    <w:p>
+      <w:pPr>
+        <w:spacing w:after="60" w:line="360" w:lineRule="auto"/>
+        <w:ind w:firstLine="850"/>
+        <w:jc w:val="both"/>
+        <w:rPr>
+          <w:rFonts w:ascii="Lora Medium" w:cs="Lora Medium" w:eastAsia="Lora Medium" w:hAnsi="Lora Medium"/>
+        </w:rPr>
+      </w:pPr>
+      <w:r>
+        <w:rPr>
+          <w:rtl w:val="0"/>
+        </w:rPr>
+      </w:r>
+    </w:p>
+    <w:p>
+      <w:pPr>
+        <w:spacing w:after="60" w:line="360" w:lineRule="auto"/>
+        <w:ind w:firstLine="850"/>
+        <w:jc w:val="both"/>
+        <w:rPr/>
+      </w:pPr>
+      <w:r>
+        <w:rPr>
+          <w:rFonts w:ascii="Lora Medium" w:cs="Lora Medium" w:eastAsia="Lora Medium" w:hAnsi="Lora Medium"/>
+          <w:rtl w:val="0"/>
+        </w:rPr>
+        <w:t xml:space="preserve">O art. 525, § 1º, VII, do CPC só admite, na impugnação, causa extintiva da obrigação “</w:t>
+      </w:r>
+      <w:r>
+        <w:rPr>
+          <w:rFonts w:ascii="Lora Medium" w:cs="Lora Medium" w:eastAsia="Lora Medium" w:hAnsi="Lora Medium"/>
+          <w:b w:val="1"/>
+          <w:bCs w:val="1"/>
           <w:u w:val="single"/>
           <w:shd w:fill="cfe2f3" w:val="clear"/>
           <w:rtl w:val="0"/>
         </w:rPr>
-        <w:t xml:space="preserve">sentença</w:t>
-      </w:r>
-      <w:r>
-        <w:rPr>
-          <w:rFonts w:ascii="Lora Medium" w:cs="Lora Medium" w:eastAsia="Lora Medium" w:hAnsi="Lora Medium"/>
-          <w:sz w:val="20"/>
-          <w:szCs w:val="20"/>
-          <w:rtl w:val="0"/>
-        </w:rPr>
-        <w:t xml:space="preserve">, que condenou o banco à restituição sem reconhecer nenhuma devolução;</w:t>
-      </w:r>
-      <w:r>
-        <w:rPr>
-          <w:rtl w:val="0"/>
-        </w:rPr>
-      </w:r>
-    </w:p>
-    <w:p>
-      <w:pPr>
-        <w:spacing w:after="0" w:line="360" w:lineRule="auto"/>
-        <w:ind w:left="2267.716535433071" w:hanging="570"/>
-        <w:jc w:val="both"/>
-        <w:rPr>
-          <w:sz w:val="20"/>
-          <w:szCs w:val="20"/>
-        </w:rPr>
-      </w:pPr>
-      <w:r>
-        <w:rPr>
-          <w:rFonts w:ascii="Lora Medium" w:cs="Lora Medium" w:eastAsia="Lora Medium" w:hAnsi="Lora Medium"/>
-          <w:sz w:val="20"/>
-          <w:szCs w:val="20"/>
-          <w:rtl w:val="0"/>
-        </w:rPr>
-        <w:t xml:space="preserve">f)</w:t>
-        <w:tab/>
-      </w:r>
-      <w:r>
-        <w:rPr>
-          <w:rFonts w:ascii="Lora Medium" w:cs="Lora Medium" w:eastAsia="Lora Medium" w:hAnsi="Lora Medium"/>
-          <w:b w:val="1"/>
-          <w:bCs w:val="1"/>
-          <w:sz w:val="20"/>
-          <w:szCs w:val="20"/>
-          <w:rtl w:val="0"/>
-        </w:rPr>
-        <w:t xml:space="preserve">19/08/2025</w:t>
-      </w:r>
-      <w:r>
-        <w:rPr>
-          <w:rFonts w:ascii="Lora Medium" w:cs="Lora Medium" w:eastAsia="Lora Medium" w:hAnsi="Lora Medium"/>
-          <w:sz w:val="20"/>
-          <w:szCs w:val="20"/>
-          <w:rtl w:val="0"/>
-        </w:rPr>
-        <w:t xml:space="preserve"> – embargos de declaração do banco contra a sentença, sem nenhuma menção aos estornos;</w:t>
-      </w:r>
-      <w:r>
-        <w:rPr>
-          <w:rtl w:val="0"/>
-        </w:rPr>
-      </w:r>
-    </w:p>
-    <w:p>
-      <w:pPr>
-        <w:spacing w:after="0" w:line="360" w:lineRule="auto"/>
-        <w:ind w:left="2267.716535433071" w:hanging="570"/>
-        <w:jc w:val="both"/>
-        <w:rPr>
-          <w:sz w:val="20"/>
-          <w:szCs w:val="20"/>
-        </w:rPr>
-      </w:pPr>
-      <w:r>
-        <w:rPr>
-          <w:rFonts w:ascii="Lora Medium" w:cs="Lora Medium" w:eastAsia="Lora Medium" w:hAnsi="Lora Medium"/>
-          <w:sz w:val="20"/>
-          <w:szCs w:val="20"/>
-          <w:rtl w:val="0"/>
-        </w:rPr>
-        <w:t xml:space="preserve">g)</w:t>
-        <w:tab/>
-      </w:r>
-      <w:r>
-        <w:rPr>
-          <w:rFonts w:ascii="Lora Medium" w:cs="Lora Medium" w:eastAsia="Lora Medium" w:hAnsi="Lora Medium"/>
-          <w:b w:val="1"/>
-          <w:bCs w:val="1"/>
-          <w:sz w:val="20"/>
-          <w:szCs w:val="20"/>
-          <w:rtl w:val="0"/>
-        </w:rPr>
-        <w:t xml:space="preserve">08/12/2025</w:t>
-      </w:r>
-      <w:r>
-        <w:rPr>
-          <w:rFonts w:ascii="Lora Medium" w:cs="Lora Medium" w:eastAsia="Lora Medium" w:hAnsi="Lora Medium"/>
-          <w:sz w:val="20"/>
-          <w:szCs w:val="20"/>
-          <w:rtl w:val="0"/>
-        </w:rPr>
-        <w:t xml:space="preserve"> – trânsito em julgado.</w:t>
-      </w:r>
-      <w:r>
-        <w:rPr>
-          <w:rtl w:val="0"/>
-        </w:rPr>
-      </w:r>
-    </w:p>
-    <w:p>
-      <w:pPr>
-        <w:spacing w:after="60" w:line="360" w:lineRule="auto"/>
-        <w:ind w:firstLine="850"/>
-        <w:jc w:val="both"/>
-        <w:rPr>
-          <w:rFonts w:ascii="Lora Medium" w:cs="Lora Medium" w:eastAsia="Lora Medium" w:hAnsi="Lora Medium"/>
-        </w:rPr>
-      </w:pPr>
-      <w:r>
-        <w:rPr>
-          <w:rtl w:val="0"/>
-        </w:rPr>
-      </w:r>
-    </w:p>
-    <w:p>
-      <w:pPr>
-        <w:spacing w:after="60" w:line="360" w:lineRule="auto"/>
-        <w:ind w:firstLine="850"/>
-        <w:jc w:val="both"/>
-        <w:rPr/>
-      </w:pPr>
-      <w:r>
-        <w:rPr>
-          <w:rFonts w:ascii="Lora Medium" w:cs="Lora Medium" w:eastAsia="Lora Medium" w:hAnsi="Lora Medium"/>
-          <w:rtl w:val="0"/>
-        </w:rPr>
-        <w:t xml:space="preserve">O art. 525, § 1º, VII, do CPC só admite, na impugnação, causa extintiva da obrigação “</w:t>
+        <w:t xml:space="preserve">desde que superveniente à sentença</w:t>
+      </w:r>
+      <w:r>
+        <w:rPr>
+          <w:rFonts w:ascii="Lora Medium" w:cs="Lora Medium" w:eastAsia="Lora Medium" w:hAnsi="Lora Medium"/>
+          <w:rtl w:val="0"/>
+        </w:rPr>
+        <w:t xml:space="preserve">”. Os estornos são de março e junho de 2025, de dois a quatro meses </w:t>
       </w:r>
       <w:r>
         <w:rPr>
@@ -1067,24 +1078,6 @@
           <w:shd w:fill="cfe2f3" w:val="clear"/>
           <w:rtl w:val="0"/>
         </w:rPr>
-        <w:t xml:space="preserve">desde que superveniente à sentença</w:t>
-      </w:r>
-      <w:r>
-        <w:rPr>
-          <w:rFonts w:ascii="Lora Medium" w:cs="Lora Medium" w:eastAsia="Lora Medium" w:hAnsi="Lora Medium"/>
-          <w:rtl w:val="0"/>
-        </w:rPr>
-        <w:t xml:space="preserve">”. Os estornos são de março e junho de 2025, de dois a quatro meses </w:t>
-      </w:r>
-      <w:r>
-        <w:rPr>
-          <w:rFonts w:ascii="Lora Medium" w:cs="Lora Medium" w:eastAsia="Lora Medium" w:hAnsi="Lora Medium"/>
-          <w:b w:val="1"/>
-          <w:bCs w:val="1"/>
-          <w:u w:val="single"/>
-          <w:shd w:fill="cfe2f3" w:val="clear"/>
-          <w:rtl w:val="0"/>
-        </w:rPr>
         <w:t xml:space="preserve">antes</w:t>
       </w:r>
       <w:r>
@@ -1098,6 +1091,49 @@
         <w:rPr>
           <w:rtl w:val="0"/>
         </w:rPr>
+      </w:r>
+    </w:p>
+    <w:p>
+      <w:pPr>
+        <w:spacing w:after="60" w:line="360" w:lineRule="auto"/>
+        <w:ind w:firstLine="850"/>
+        <w:jc w:val="both"/>
+        <w:rPr/>
+      </w:pPr>
+      <w:r>
+        <w:rPr>
+          <w:rFonts w:ascii="Lora Medium" w:cs="Lora Medium" w:eastAsia="Lora Medium" w:hAnsi="Lora Medium"/>
+          <w:rtl w:val="0"/>
+        </w:rPr>
+        <w:t xml:space="preserve">A contestação, apresentada em 12/05/2025 (ID 75506718 da origem), é expressa:</w:t>
+      </w:r>
+    </w:p>
+    <w:p>
+      <w:pPr>
+        <w:pBdr>
+          <w:top w:color="9aa0a6" w:space="6" w:sz="4" w:val="single"/>
+        </w:pBdr>
+        <w:spacing w:after="200" w:before="160" w:line="240" w:lineRule="auto"/>
+        <w:ind w:left="2270" w:right="570" w:firstLine="0"/>
+        <w:jc w:val="both"/>
+        <w:rPr>
+          <w:rFonts w:ascii="Lora Medium" w:cs="Lora Medium" w:eastAsia="Lora Medium" w:hAnsi="Lora Medium"/>
+          <w:i w:val="1"/>
+          <w:iCs w:val="1"/>
+          <w:sz w:val="18"/>
+          <w:szCs w:val="18"/>
+        </w:rPr>
+      </w:pPr>
+      <w:r>
+        <w:rPr>
+          <w:rFonts w:ascii="Lora Medium" w:cs="Lora Medium" w:eastAsia="Lora Medium" w:hAnsi="Lora Medium"/>
+          <w:i w:val="1"/>
+          <w:iCs w:val="1"/>
+          <w:sz w:val="18"/>
+          <w:szCs w:val="18"/>
+          <w:rtl w:val="0"/>
+        </w:rPr>
+        <w:t xml:space="preserve">Ao liquidar a operação e restituir valores, o banco demonstrou sua responsabilidade em lidar com situações de fraude de maneira eficiente e ética. (...) Impende registrar que os valores descontados já foram devidamente restituídos, não havendo que se falar de descontos contínuos e de necessidade de resolução, o que reforça a atitude de boa-fé do Banco PAN. De acordo com os dados fornecidos no demonstrativo, fica claro que a operação foi baixada e ocorreu o estorno das parcelas descontadas. O autor já obteve a satisfação de sua pretensão, não necessitando mais da intervenção do Poder Judiciário (...).</w:t>
       </w:r>
     </w:p>
     <w:p>
@@ -1340,6 +1376,21 @@
     </w:p>
     <w:p>
       <w:pPr>
+        <w:spacing w:after="60" w:line="360" w:lineRule="auto"/>
+        <w:ind w:firstLine="850"/>
+        <w:jc w:val="both"/>
+        <w:rPr/>
+      </w:pPr>
+      <w:r>
+        <w:rPr>
+          <w:rFonts w:ascii="Lora Medium" w:cs="Lora Medium" w:eastAsia="Lora Medium" w:hAnsi="Lora Medium"/>
+          <w:rtl w:val="0"/>
+        </w:rPr>
+        <w:t xml:space="preserve">Há mais. Em 12/05/2025, na contestação, o banco afirmou que todos os valores descontados “já foram devidamente restituídos”. Pelo seu próprio demonstrativo, porém, as 31 parcelas do contrato nº 365738167-3 só foram estornadas em 18/06/2025, mais de um mês depois. O banco afirmou em juízo uma restituição que, para esse contrato, sequer tinha sido lançada.</w:t>
+      </w:r>
+    </w:p>
+    <w:p>
+      <w:pPr>
         <w:keepNext w:val="1"/>
         <w:tabs>
           <w:tab w:val="left" w:leader="none" w:pos="700"/>
@@ -1547,6 +1598,21 @@
         <w:rPr>
           <w:rtl w:val="0"/>
         </w:rPr>
+      </w:r>
+    </w:p>
+    <w:p>
+      <w:pPr>
+        <w:spacing w:after="60" w:line="360" w:lineRule="auto"/>
+        <w:ind w:firstLine="850"/>
+        <w:jc w:val="both"/>
+        <w:rPr/>
+      </w:pPr>
+      <w:r>
+        <w:rPr>
+          <w:rFonts w:ascii="Lora Medium" w:cs="Lora Medium" w:eastAsia="Lora Medium" w:hAnsi="Lora Medium"/>
+          <w:rtl w:val="0"/>
+        </w:rPr>
+        <w:t xml:space="preserve">O único documento de transferência que o banco juntou foi o “Recibo de Transferência via SPB” de 19/10/2022 (ID 77594125 da origem), produzido por ele próprio, que trata da liberação dos empréstimos, e não de qualquer devolução. Ele aponta como destino exatamente a conta nº 48723-3 da agência 2298, que o Banco do Brasil declarou não pertencer à autora. Para os estornos, o banco não juntou nem mesmo um documento desse tipo.</w:t>
       </w:r>
     </w:p>
     <w:p>

</xml_diff>

<commit_message>
Contrarrazões ao agravo: datas do cabeçalho do demonstrativo e desconto de 09/06/2025
Co-Authored-By: Claude Opus 5.5 <noreply@anthropic.com>
Claude-Session: https://claude.ai/code/session_01RSEcSvs1Px517d8mUYokdi
</commit_message>
<xml_diff>
--- a/0800122-42.2025 - Francisca Sousa/Contrarrazões ao agravo de instrumento - Francisca Sousa da Silva.docx
+++ b/0800122-42.2025 - Francisca Sousa/Contrarrazões ao agravo de instrumento - Francisca Sousa da Silva.docx
@@ -1105,6 +1105,21 @@
           <w:rFonts w:ascii="Lora Medium" w:cs="Lora Medium" w:eastAsia="Lora Medium" w:hAnsi="Lora Medium"/>
           <w:rtl w:val="0"/>
         </w:rPr>
+        <w:t xml:space="preserve">As datas que aparecem no cabeçalho do demonstrativo (“Prc.: 25/11/2025”, “Sist.: 26/11/2025” e “Cont.: 21/11/2025”) não se referem aos estornos. Elas se repetem, idênticas, em todas as páginas do relatório e indicam apenas a sua emissão, feita três dias antes da juntada aos autos, em 28/11/2025. A data de cada lançamento consta da coluna própria (“DT. PGTO”), linha por linha, e é sempre 28/03/2025 ou 18/06/2025. Tanto é assim que, já na contestação de 12/05/2025, o banco afirmava que “ocorreu o estorno das parcelas descontadas”, e a decisão que deferiu a tutela recursal registrou “lançamentos datados de 18/06/2025”.</w:t>
+      </w:r>
+    </w:p>
+    <w:p>
+      <w:pPr>
+        <w:spacing w:after="60" w:line="360" w:lineRule="auto"/>
+        <w:ind w:firstLine="850"/>
+        <w:jc w:val="both"/>
+        <w:rPr/>
+      </w:pPr>
+      <w:r>
+        <w:rPr>
+          <w:rFonts w:ascii="Lora Medium" w:cs="Lora Medium" w:eastAsia="Lora Medium" w:hAnsi="Lora Medium"/>
+          <w:rtl w:val="0"/>
+        </w:rPr>
         <w:t xml:space="preserve">A contestação, apresentada em 12/05/2025 (ID 75506718 da origem), é expressa:</w:t>
       </w:r>
     </w:p>
@@ -1387,6 +1402,21 @@
           <w:rtl w:val="0"/>
         </w:rPr>
         <w:t xml:space="preserve">Há mais. Em 12/05/2025, na contestação, o banco afirmou que todos os valores descontados “já foram devidamente restituídos”. Pelo seu próprio demonstrativo, porém, as 31 parcelas do contrato nº 365738167-3 só foram estornadas em 18/06/2025, mais de um mês depois. O banco afirmou em juízo uma restituição que, para esse contrato, sequer tinha sido lançada.</w:t>
+      </w:r>
+    </w:p>
+    <w:p>
+      <w:pPr>
+        <w:spacing w:after="60" w:line="360" w:lineRule="auto"/>
+        <w:ind w:firstLine="850"/>
+        <w:jc w:val="both"/>
+        <w:rPr/>
+      </w:pPr>
+      <w:r>
+        <w:rPr>
+          <w:rFonts w:ascii="Lora Medium" w:cs="Lora Medium" w:eastAsia="Lora Medium" w:hAnsi="Lora Medium"/>
+          <w:rtl w:val="0"/>
+        </w:rPr>
+        <w:t xml:space="preserve">Pior ainda. Depois de afirmar ao Juízo, em 12/05/2025, que já havia restituído tudo, o banco continuou descontando do benefício da autora. O próprio demonstrativo registra o desconto da 31ª parcela do contrato nº 365738167-3 em 09/06/2025, quase um mês depois da contestação. Enquanto dizia em juízo que nada mais era devido, o banco seguia retendo parte da única renda de uma idosa em tratamento contra o câncer.</w:t>
       </w:r>
     </w:p>
     <w:p>

</xml_diff>